<commit_message>
updated site and CV with publication details for moral risk and uni size
</commit_message>
<xml_diff>
--- a/cv/cv.docx
+++ b/cv/cv.docx
@@ -28,7 +28,19 @@
         <w:rPr>
           <w:rFonts w:cstheme="minorHAnsi"/>
         </w:rPr>
-        <w:t>October 2025</w:t>
+        <w:t>January</w:t>
+      </w:r>
+      <w:r>
+        <w:rPr>
+          <w:rFonts w:cstheme="minorHAnsi"/>
+        </w:rPr>
+        <w:t xml:space="preserve"> 202</w:t>
+      </w:r>
+      <w:r>
+        <w:rPr>
+          <w:rFonts w:cstheme="minorHAnsi"/>
+        </w:rPr>
+        <w:t>6</w:t>
       </w:r>
     </w:p>
     <w:p>
@@ -225,9 +237,17 @@
         <w:ind w:left="709" w:hanging="709"/>
       </w:pPr>
       <w:r>
-        <w:t xml:space="preserve">(Forthcoming) ‘The Size of the Universe against Robust Realism’ in </w:t>
-      </w:r>
-      <w:proofErr w:type="gramStart"/>
+        <w:t>2026</w:t>
+      </w:r>
+      <w:r>
+        <w:tab/>
+      </w:r>
+      <w:r>
+        <w:t>‘The Size of the Universe against Robust Realism’</w:t>
+      </w:r>
+      <w:r>
+        <w:t xml:space="preserve">, </w:t>
+      </w:r>
       <w:r>
         <w:rPr>
           <w:i/>
@@ -235,10 +255,41 @@
         </w:rPr>
         <w:t>Ethics</w:t>
       </w:r>
-      <w:proofErr w:type="gramEnd"/>
+      <w:r>
+        <w:t xml:space="preserve"> Vol. </w:t>
+      </w:r>
+      <w:r>
+        <w:t>136</w:t>
+      </w:r>
+      <w:r>
+        <w:t xml:space="preserve">, No. </w:t>
+      </w:r>
+      <w:r>
+        <w:t xml:space="preserve">2, </w:t>
+      </w:r>
+      <w:r>
+        <w:t xml:space="preserve">pp. </w:t>
+      </w:r>
+      <w:r>
+        <w:t>246-272</w:t>
+      </w:r>
       <w:r>
         <w:t>.</w:t>
       </w:r>
+      <w:r>
+        <w:br/>
+      </w:r>
+      <w:proofErr w:type="spellStart"/>
+      <w:r>
+        <w:t>doi</w:t>
+      </w:r>
+      <w:proofErr w:type="spellEnd"/>
+      <w:r>
+        <w:t xml:space="preserve">: </w:t>
+      </w:r>
+      <w:r>
+        <w:t>10.1086/738320</w:t>
+      </w:r>
     </w:p>
     <w:p>
       <w:pPr>
@@ -259,7 +310,13 @@
       </w:r>
       <w:proofErr w:type="spellEnd"/>
       <w:r>
-        <w:t xml:space="preserve"> Medicine’ in </w:t>
+        <w:t xml:space="preserve"> Medicine’</w:t>
+      </w:r>
+      <w:r>
+        <w:t>,</w:t>
+      </w:r>
+      <w:r>
+        <w:t xml:space="preserve"> </w:t>
       </w:r>
       <w:r>
         <w:rPr>
@@ -269,13 +326,16 @@
         <w:t>Ratio</w:t>
       </w:r>
       <w:r>
-        <w:t xml:space="preserve"> (special issue on risk</w:t>
-      </w:r>
-      <w:r>
-        <w:t>, Early View</w:t>
-      </w:r>
-      <w:r>
-        <w:t>).</w:t>
+        <w:t xml:space="preserve"> (special issue on risk)</w:t>
+      </w:r>
+      <w:r>
+        <w:t>, 38</w:t>
+      </w:r>
+      <w:r>
+        <w:t>, pp.</w:t>
+      </w:r>
+      <w:r>
+        <w:t xml:space="preserve"> 239-247.</w:t>
       </w:r>
       <w:r>
         <w:br/>
@@ -354,11 +414,24 @@
       </w:r>
       <w:proofErr w:type="spellEnd"/>
       <w:r>
-        <w:t xml:space="preserve"> 43: 479–489. </w:t>
+        <w:t xml:space="preserve"> 43: 479–489.</w:t>
       </w:r>
       <w:r>
         <w:br/>
-        <w:t>doi:10.1007/s11245-024-10029-8</w:t>
+      </w:r>
+      <w:proofErr w:type="spellStart"/>
+      <w:r>
+        <w:t>doi</w:t>
+      </w:r>
+      <w:proofErr w:type="spellEnd"/>
+      <w:r>
+        <w:t>:</w:t>
+      </w:r>
+      <w:r>
+        <w:t xml:space="preserve"> </w:t>
+      </w:r>
+      <w:r>
+        <w:t>10.1007/s11245-024-10029-8</w:t>
       </w:r>
     </w:p>
     <w:p>
@@ -393,7 +466,39 @@
         <w:rPr>
           <w:rFonts w:cstheme="minorHAnsi"/>
         </w:rPr>
-        <w:t>, edited by Henrik Andersson and Anders Herlitz. Routledge. doi:10.4324/9781003148012-13</w:t>
+        <w:t>, edited by Henrik Andersson and Anders Herlitz. Routledge.</w:t>
+      </w:r>
+      <w:r>
+        <w:rPr>
+          <w:rFonts w:cstheme="minorHAnsi"/>
+        </w:rPr>
+        <w:br/>
+      </w:r>
+      <w:proofErr w:type="spellStart"/>
+      <w:r>
+        <w:rPr>
+          <w:rFonts w:cstheme="minorHAnsi"/>
+        </w:rPr>
+        <w:t>doi</w:t>
+      </w:r>
+      <w:proofErr w:type="spellEnd"/>
+      <w:r>
+        <w:rPr>
+          <w:rFonts w:cstheme="minorHAnsi"/>
+        </w:rPr>
+        <w:t>:</w:t>
+      </w:r>
+      <w:r>
+        <w:rPr>
+          <w:rFonts w:cstheme="minorHAnsi"/>
+        </w:rPr>
+        <w:t xml:space="preserve"> </w:t>
+      </w:r>
+      <w:r>
+        <w:rPr>
+          <w:rFonts w:cstheme="minorHAnsi"/>
+        </w:rPr>
+        <w:t>10.4324/9781003148012-13</w:t>
       </w:r>
     </w:p>
     <w:p>
@@ -428,7 +533,39 @@
         <w:rPr>
           <w:rFonts w:cstheme="minorHAnsi"/>
         </w:rPr>
-        <w:t xml:space="preserve"> vol. 6, no. 34. doi:10.3998/ergo.12405314.0006.034</w:t>
+        <w:t xml:space="preserve"> vol. 6, no. 34.</w:t>
+      </w:r>
+      <w:r>
+        <w:rPr>
+          <w:rFonts w:cstheme="minorHAnsi"/>
+        </w:rPr>
+        <w:br/>
+      </w:r>
+      <w:proofErr w:type="spellStart"/>
+      <w:r>
+        <w:rPr>
+          <w:rFonts w:cstheme="minorHAnsi"/>
+        </w:rPr>
+        <w:t>doi</w:t>
+      </w:r>
+      <w:proofErr w:type="spellEnd"/>
+      <w:r>
+        <w:rPr>
+          <w:rFonts w:cstheme="minorHAnsi"/>
+        </w:rPr>
+        <w:t>:</w:t>
+      </w:r>
+      <w:r>
+        <w:rPr>
+          <w:rFonts w:cstheme="minorHAnsi"/>
+        </w:rPr>
+        <w:t xml:space="preserve"> </w:t>
+      </w:r>
+      <w:r>
+        <w:rPr>
+          <w:rFonts w:cstheme="minorHAnsi"/>
+        </w:rPr>
+        <w:t>10.3998/ergo.12405314.0006.034</w:t>
       </w:r>
     </w:p>
     <w:p>
@@ -477,7 +614,39 @@
         <w:rPr>
           <w:rFonts w:cstheme="minorHAnsi"/>
         </w:rPr>
-        <w:t xml:space="preserve"> vol. 16, no. 3 (2019). doi:10.26556/</w:t>
+        <w:t xml:space="preserve"> vol. 16, no. 3.</w:t>
+      </w:r>
+      <w:r>
+        <w:rPr>
+          <w:rFonts w:cstheme="minorHAnsi"/>
+        </w:rPr>
+        <w:br/>
+      </w:r>
+      <w:proofErr w:type="spellStart"/>
+      <w:r>
+        <w:rPr>
+          <w:rFonts w:cstheme="minorHAnsi"/>
+        </w:rPr>
+        <w:t>doi</w:t>
+      </w:r>
+      <w:proofErr w:type="spellEnd"/>
+      <w:r>
+        <w:rPr>
+          <w:rFonts w:cstheme="minorHAnsi"/>
+        </w:rPr>
+        <w:t>:</w:t>
+      </w:r>
+      <w:r>
+        <w:rPr>
+          <w:rFonts w:cstheme="minorHAnsi"/>
+        </w:rPr>
+        <w:t xml:space="preserve"> </w:t>
+      </w:r>
+      <w:r>
+        <w:rPr>
+          <w:rFonts w:cstheme="minorHAnsi"/>
+        </w:rPr>
+        <w:t>10.26556/</w:t>
       </w:r>
       <w:proofErr w:type="gramStart"/>
       <w:r>
@@ -540,7 +709,13 @@
         <w:rPr>
           <w:rFonts w:cstheme="minorHAnsi"/>
         </w:rPr>
-        <w:t xml:space="preserve"> 83: 341-363. </w:t>
+        <w:t xml:space="preserve"> 83: 341-363.</w:t>
+      </w:r>
+      <w:r>
+        <w:rPr>
+          <w:rFonts w:cstheme="minorHAnsi"/>
+        </w:rPr>
+        <w:br/>
       </w:r>
       <w:proofErr w:type="spellStart"/>
       <w:r>
@@ -603,7 +778,39 @@
         <w:rPr>
           <w:rFonts w:cstheme="minorHAnsi"/>
         </w:rPr>
-        <w:t xml:space="preserve"> Vol. 126, No. 2, pp. 474-488. doi:10.1086/683533.</w:t>
+        <w:t xml:space="preserve"> Vol. 126, No. 2, pp. 474-488.</w:t>
+      </w:r>
+      <w:r>
+        <w:rPr>
+          <w:rFonts w:cstheme="minorHAnsi"/>
+        </w:rPr>
+        <w:br/>
+      </w:r>
+      <w:proofErr w:type="spellStart"/>
+      <w:r>
+        <w:rPr>
+          <w:rFonts w:cstheme="minorHAnsi"/>
+        </w:rPr>
+        <w:t>doi</w:t>
+      </w:r>
+      <w:proofErr w:type="spellEnd"/>
+      <w:r>
+        <w:rPr>
+          <w:rFonts w:cstheme="minorHAnsi"/>
+        </w:rPr>
+        <w:t>:</w:t>
+      </w:r>
+      <w:r>
+        <w:rPr>
+          <w:rFonts w:cstheme="minorHAnsi"/>
+        </w:rPr>
+        <w:t xml:space="preserve"> </w:t>
+      </w:r>
+      <w:r>
+        <w:rPr>
+          <w:rFonts w:cstheme="minorHAnsi"/>
+        </w:rPr>
+        <w:t>10.1086/683533.</w:t>
       </w:r>
     </w:p>
     <w:p>
@@ -638,7 +845,46 @@
         <w:rPr>
           <w:rFonts w:cstheme="minorHAnsi"/>
         </w:rPr>
-        <w:t xml:space="preserve"> Vol. 124, No. 3, pp. 557-571. doi:10.1086/674844</w:t>
+        <w:t xml:space="preserve"> Vol. 124, No. 3, pp. </w:t>
+      </w:r>
+      <w:r>
+        <w:rPr>
+          <w:rFonts w:cstheme="minorHAnsi"/>
+        </w:rPr>
+        <w:lastRenderedPageBreak/>
+        <w:t>557-571.</w:t>
+      </w:r>
+      <w:r>
+        <w:rPr>
+          <w:rFonts w:cstheme="minorHAnsi"/>
+        </w:rPr>
+        <w:br/>
+      </w:r>
+      <w:proofErr w:type="spellStart"/>
+      <w:r>
+        <w:rPr>
+          <w:rFonts w:cstheme="minorHAnsi"/>
+        </w:rPr>
+        <w:t>doi</w:t>
+      </w:r>
+      <w:proofErr w:type="spellEnd"/>
+      <w:r>
+        <w:rPr>
+          <w:rFonts w:cstheme="minorHAnsi"/>
+        </w:rPr>
+        <w:t>:</w:t>
+      </w:r>
+      <w:r>
+        <w:rPr>
+          <w:rFonts w:cstheme="minorHAnsi"/>
+        </w:rPr>
+        <w:t xml:space="preserve"> </w:t>
+      </w:r>
+      <w:r>
+        <w:rPr>
+          <w:rFonts w:cstheme="minorHAnsi"/>
+        </w:rPr>
+        <w:t>10.1086/674844</w:t>
       </w:r>
     </w:p>
     <w:p>
@@ -675,14 +921,39 @@
         <w:rPr>
           <w:rFonts w:cstheme="minorHAnsi"/>
         </w:rPr>
-        <w:t xml:space="preserve"> volume 26, issue 01, pp. 51-60. </w:t>
-      </w:r>
-      <w:r>
-        <w:rPr>
-          <w:rFonts w:cstheme="minorHAnsi"/>
-        </w:rPr>
-        <w:lastRenderedPageBreak/>
-        <w:t>doi:10.1017/S095382081300023X</w:t>
+        <w:t xml:space="preserve"> volume 26, issue 01, pp. 51-60.</w:t>
+      </w:r>
+      <w:r>
+        <w:rPr>
+          <w:rFonts w:cstheme="minorHAnsi"/>
+        </w:rPr>
+        <w:br/>
+      </w:r>
+      <w:proofErr w:type="spellStart"/>
+      <w:r>
+        <w:rPr>
+          <w:rFonts w:cstheme="minorHAnsi"/>
+        </w:rPr>
+        <w:t>doi</w:t>
+      </w:r>
+      <w:proofErr w:type="spellEnd"/>
+      <w:r>
+        <w:rPr>
+          <w:rFonts w:cstheme="minorHAnsi"/>
+        </w:rPr>
+        <w:t>:</w:t>
+      </w:r>
+      <w:r>
+        <w:rPr>
+          <w:rFonts w:cstheme="minorHAnsi"/>
+        </w:rPr>
+        <w:t xml:space="preserve"> </w:t>
+      </w:r>
+      <w:r>
+        <w:rPr>
+          <w:rFonts w:cstheme="minorHAnsi"/>
+        </w:rPr>
+        <w:t>10.1017/S095382081300023X</w:t>
       </w:r>
     </w:p>
     <w:p>
@@ -868,7 +1139,33 @@
         <w:rPr>
           <w:rFonts w:cstheme="minorHAnsi"/>
         </w:rPr>
-        <w:t>, Volume 78, Issue 3, pp. 583-586. doi:10.1093/</w:t>
+        <w:t xml:space="preserve">, Volume 78, Issue 3, pp. 583-586. </w:t>
+      </w:r>
+      <w:proofErr w:type="spellStart"/>
+      <w:r>
+        <w:rPr>
+          <w:rFonts w:cstheme="minorHAnsi"/>
+        </w:rPr>
+        <w:t>doi</w:t>
+      </w:r>
+      <w:proofErr w:type="spellEnd"/>
+      <w:r>
+        <w:rPr>
+          <w:rFonts w:cstheme="minorHAnsi"/>
+        </w:rPr>
+        <w:t>:</w:t>
+      </w:r>
+      <w:r>
+        <w:rPr>
+          <w:rFonts w:cstheme="minorHAnsi"/>
+        </w:rPr>
+        <w:t xml:space="preserve"> </w:t>
+      </w:r>
+      <w:r>
+        <w:rPr>
+          <w:rFonts w:cstheme="minorHAnsi"/>
+        </w:rPr>
+        <w:t>10.1093/</w:t>
       </w:r>
       <w:proofErr w:type="spellStart"/>
       <w:r>
@@ -1378,6 +1675,7 @@
         <w:rPr>
           <w:rFonts w:cstheme="minorHAnsi"/>
         </w:rPr>
+        <w:lastRenderedPageBreak/>
         <w:t xml:space="preserve">Tommaso Soriani on ethics and </w:t>
       </w:r>
       <w:proofErr w:type="spellStart"/>
@@ -1454,7 +1752,6 @@
         </w:numPr>
       </w:pPr>
       <w:r>
-        <w:lastRenderedPageBreak/>
         <w:t>Dannish Kashmiri on ontology and ethical objectivity</w:t>
       </w:r>
       <w:r>
@@ -1839,6 +2136,7 @@
       </w:pPr>
       <w:bookmarkStart w:id="8" w:name="conferences-and-workshops-organised"/>
       <w:r>
+        <w:lastRenderedPageBreak/>
         <w:t>Conferences and workshops organised</w:t>
       </w:r>
       <w:bookmarkEnd w:id="8"/>
@@ -1871,7 +2169,6 @@
     </w:p>
     <w:p>
       <w:r>
-        <w:lastRenderedPageBreak/>
         <w:t>2025 May</w:t>
       </w:r>
       <w:r>
@@ -2274,6 +2571,7 @@
         <w:rPr>
           <w:rFonts w:cstheme="minorHAnsi"/>
         </w:rPr>
+        <w:lastRenderedPageBreak/>
         <w:t>Administrative roles at UNC Chapel Hill</w:t>
       </w:r>
       <w:bookmarkEnd w:id="10"/>
@@ -2337,7 +2635,6 @@
         <w:rPr>
           <w:rFonts w:cstheme="minorHAnsi"/>
         </w:rPr>
-        <w:lastRenderedPageBreak/>
         <w:t>2011–12</w:t>
       </w:r>
       <w:r>
@@ -2670,6 +2967,7 @@
         <w:rPr>
           <w:rFonts w:cstheme="minorHAnsi"/>
         </w:rPr>
+        <w:lastRenderedPageBreak/>
         <w:t>‘Indeterminacy and Agency’:</w:t>
       </w:r>
     </w:p>
@@ -2694,11 +2992,7 @@
         </w:numPr>
       </w:pPr>
       <w:r>
-        <w:t xml:space="preserve">Incommensurability: Vagueness, Parity and other Non-Conventional Comparative Relations </w:t>
-      </w:r>
-      <w:r>
-        <w:lastRenderedPageBreak/>
-        <w:t>workshop in Stockholm. 2019.</w:t>
+        <w:t>Incommensurability: Vagueness, Parity and other Non-Conventional Comparative Relations workshop in Stockholm. 2019.</w:t>
       </w:r>
     </w:p>
     <w:p>

</xml_diff>